<commit_message>
End every study export with a verified Sources and go deeper block.
Each room keeps a sources.json of links opened in 2026-10. Unopened pages stay confirm with no URL. HTML, Markdown, PDF, DOCX, and the teaching deck render that block, and the campus lesson appends the same list.

Co-authored-by: CYPHER0X9 <cipher0x9@users.noreply.github.com>
</commit_message>
<xml_diff>
--- a/downloads/templates/cutover-checklist.docx
+++ b/downloads/templates/cutover-checklist.docx
@@ -43,6 +43,214 @@
     <w:p>
       <w:r>
         <w:t>Independent, free, learning-only student project. Trademarks belong to their owners. Not affiliated or endorsed. Concerns via https://cyphermonkeylabs.com/#contact. Nothing is sold.</w:t>
+      </w:r>
+    </w:p>
+    <w:p>
+      <w:pPr>
+        <w:pStyle w:val="Heading1"/>
+      </w:pPr>
+      <w:r>
+        <w:t>Sources and go deeper</w:t>
+      </w:r>
+    </w:p>
+    <w:p>
+      <w:r>
+        <w:t>Opened 2026-10. A row marked confirm has no link, because that page was not verified.</w:t>
+      </w:r>
+    </w:p>
+    <w:p>
+      <w:r>
+        <w:t xml:space="preserve">Webex. </w:t>
+      </w:r>
+      <w:hyperlink r:id="rId9">
+        <w:r>
+          <w:rPr>
+            <w:color w:val="1E3A8A"/>
+            <w:u w:val="single"/>
+          </w:rPr>
+          <w:t>Get started with Webex Calling</w:t>
+        </w:r>
+      </w:hyperlink>
+      <w:r>
+        <w:t>. last checked 2026-10</w:t>
+      </w:r>
+    </w:p>
+    <w:p>
+      <w:r>
+        <w:t xml:space="preserve">Webex. </w:t>
+      </w:r>
+      <w:hyperlink r:id="rId10">
+        <w:r>
+          <w:rPr>
+            <w:color w:val="1E3A8A"/>
+            <w:u w:val="single"/>
+          </w:rPr>
+          <w:t>Webex Help Center</w:t>
+        </w:r>
+      </w:hyperlink>
+      <w:r>
+        <w:t>. last checked 2026-10</w:t>
+      </w:r>
+    </w:p>
+    <w:p>
+      <w:r>
+        <w:t xml:space="preserve">Cisco. </w:t>
+      </w:r>
+      <w:hyperlink r:id="rId11">
+        <w:r>
+          <w:rPr>
+            <w:color w:val="1E3A8A"/>
+            <w:u w:val="single"/>
+          </w:rPr>
+          <w:t>Cisco Unified Communications Manager product support</w:t>
+        </w:r>
+      </w:hyperlink>
+      <w:r>
+        <w:t>. last checked 2026-10</w:t>
+      </w:r>
+    </w:p>
+    <w:p>
+      <w:r>
+        <w:t xml:space="preserve">Cisco. </w:t>
+      </w:r>
+      <w:hyperlink r:id="rId12">
+        <w:r>
+          <w:rPr>
+            <w:color w:val="1E3A8A"/>
+            <w:u w:val="single"/>
+          </w:rPr>
+          <w:t>Cisco Collaboration Preferred Architectures</w:t>
+        </w:r>
+      </w:hyperlink>
+      <w:r>
+        <w:t>. last checked 2026-10</w:t>
+      </w:r>
+    </w:p>
+    <w:p>
+      <w:r>
+        <w:t xml:space="preserve">Community. </w:t>
+      </w:r>
+      <w:hyperlink r:id="rId13">
+        <w:r>
+          <w:rPr>
+            <w:color w:val="1E3A8A"/>
+            <w:u w:val="single"/>
+          </w:rPr>
+          <w:t>Cisco Community, Collaboration knowledge base</w:t>
+        </w:r>
+      </w:hyperlink>
+      <w:r>
+        <w:t>. last checked 2026-10</w:t>
+      </w:r>
+    </w:p>
+    <w:p>
+      <w:r>
+        <w:t xml:space="preserve">Wikipedia. </w:t>
+      </w:r>
+      <w:hyperlink r:id="rId14">
+        <w:r>
+          <w:rPr>
+            <w:color w:val="1E3A8A"/>
+            <w:u w:val="single"/>
+          </w:rPr>
+          <w:t>Voice over IP (Wikipedia)</w:t>
+        </w:r>
+      </w:hyperlink>
+      <w:r>
+        <w:t>. last checked 2026-10</w:t>
+      </w:r>
+    </w:p>
+    <w:p>
+      <w:r>
+        <w:t xml:space="preserve">Cisco. </w:t>
+      </w:r>
+      <w:hyperlink r:id="rId15">
+        <w:r>
+          <w:rPr>
+            <w:color w:val="1E3A8A"/>
+            <w:u w:val="single"/>
+          </w:rPr>
+          <w:t>System Configuration Guide for CUCM, Release 15</w:t>
+        </w:r>
+      </w:hyperlink>
+      <w:r>
+        <w:t>. last checked 2026-10</w:t>
+      </w:r>
+    </w:p>
+    <w:p>
+      <w:r>
+        <w:t xml:space="preserve">Webex. </w:t>
+      </w:r>
+      <w:hyperlink r:id="rId16">
+        <w:r>
+          <w:rPr>
+            <w:color w:val="1E3A8A"/>
+            <w:u w:val="single"/>
+          </w:rPr>
+          <w:t>Get started with Local Gateway</w:t>
+        </w:r>
+      </w:hyperlink>
+      <w:r>
+        <w:t>. last checked 2026-10</w:t>
+      </w:r>
+    </w:p>
+    <w:p>
+      <w:r>
+        <w:t xml:space="preserve">Webex. </w:t>
+      </w:r>
+      <w:hyperlink r:id="rId17">
+        <w:r>
+          <w:rPr>
+            <w:color w:val="1E3A8A"/>
+            <w:u w:val="single"/>
+          </w:rPr>
+          <w:t>Configure Local Gateway on Cisco IOS XE for Webex Calling</w:t>
+        </w:r>
+      </w:hyperlink>
+      <w:r>
+        <w:t>. last checked 2026-10</w:t>
+      </w:r>
+    </w:p>
+    <w:p>
+      <w:r>
+        <w:t xml:space="preserve">Protocol and ports. </w:t>
+      </w:r>
+      <w:hyperlink r:id="rId18">
+        <w:r>
+          <w:rPr>
+            <w:color w:val="1E3A8A"/>
+            <w:u w:val="single"/>
+          </w:rPr>
+          <w:t>Port reference for Webex Calling</w:t>
+        </w:r>
+      </w:hyperlink>
+      <w:r>
+        <w:t>. last checked 2026-10</w:t>
+      </w:r>
+    </w:p>
+    <w:p>
+      <w:r>
+        <w:t xml:space="preserve">Webex. </w:t>
+      </w:r>
+      <w:r>
+        <w:t>Webex Calling survivability gateway guide. confirm. A survivability-gateway article was not opened, so this row has no link. The local-gateway guide that did open is listed above. last checked 2026-10</w:t>
+      </w:r>
+    </w:p>
+    <w:p>
+      <w:r>
+        <w:t xml:space="preserve">Cisco. </w:t>
+      </w:r>
+      <w:hyperlink r:id="rId19">
+        <w:r>
+          <w:rPr>
+            <w:color w:val="1E3A8A"/>
+            <w:u w:val="single"/>
+          </w:rPr>
+          <w:t>Cisco Unified SRST product support</w:t>
+        </w:r>
+      </w:hyperlink>
+      <w:r>
+        <w:t>. last checked 2026-10</w:t>
       </w:r>
     </w:p>
     <w:sectPr>

</xml_diff>

<commit_message>
Round 3: floating menus, read-along, exports, and sources (#18)
* Add floating chrome, read-along glow, and section exports.

The university and campus menus now float with glow and depth, motion respects reduced-motion, and each room section has its own export row. Flagship footers use the three studio icons. The campus checker accepts those official links and the university front door.

Co-authored-by: CYPHER0X9 <cipher0x9@users.noreply.github.com>

* End every study export with a verified Sources and go deeper block.

Each room keeps a sources.json of links opened in 2026-10. Unopened pages stay confirm with no URL. HTML, Markdown, PDF, DOCX, and the teaching deck render that block, and the campus lesson appends the same list.

Co-authored-by: CYPHER0X9 <cipher0x9@users.noreply.github.com>

---------

Co-authored-by: Cursor Agent <cursoragent@cursor.com>
Co-authored-by: CYPHER0X9 <cipher0x9@users.noreply.github.com>
</commit_message>
<xml_diff>
--- a/downloads/templates/cutover-checklist.docx
+++ b/downloads/templates/cutover-checklist.docx
@@ -43,6 +43,214 @@
     <w:p>
       <w:r>
         <w:t>Independent, free, learning-only student project. Trademarks belong to their owners. Not affiliated or endorsed. Concerns via https://cyphermonkeylabs.com/#contact. Nothing is sold.</w:t>
+      </w:r>
+    </w:p>
+    <w:p>
+      <w:pPr>
+        <w:pStyle w:val="Heading1"/>
+      </w:pPr>
+      <w:r>
+        <w:t>Sources and go deeper</w:t>
+      </w:r>
+    </w:p>
+    <w:p>
+      <w:r>
+        <w:t>Opened 2026-10. A row marked confirm has no link, because that page was not verified.</w:t>
+      </w:r>
+    </w:p>
+    <w:p>
+      <w:r>
+        <w:t xml:space="preserve">Webex. </w:t>
+      </w:r>
+      <w:hyperlink r:id="rId9">
+        <w:r>
+          <w:rPr>
+            <w:color w:val="1E3A8A"/>
+            <w:u w:val="single"/>
+          </w:rPr>
+          <w:t>Get started with Webex Calling</w:t>
+        </w:r>
+      </w:hyperlink>
+      <w:r>
+        <w:t>. last checked 2026-10</w:t>
+      </w:r>
+    </w:p>
+    <w:p>
+      <w:r>
+        <w:t xml:space="preserve">Webex. </w:t>
+      </w:r>
+      <w:hyperlink r:id="rId10">
+        <w:r>
+          <w:rPr>
+            <w:color w:val="1E3A8A"/>
+            <w:u w:val="single"/>
+          </w:rPr>
+          <w:t>Webex Help Center</w:t>
+        </w:r>
+      </w:hyperlink>
+      <w:r>
+        <w:t>. last checked 2026-10</w:t>
+      </w:r>
+    </w:p>
+    <w:p>
+      <w:r>
+        <w:t xml:space="preserve">Cisco. </w:t>
+      </w:r>
+      <w:hyperlink r:id="rId11">
+        <w:r>
+          <w:rPr>
+            <w:color w:val="1E3A8A"/>
+            <w:u w:val="single"/>
+          </w:rPr>
+          <w:t>Cisco Unified Communications Manager product support</w:t>
+        </w:r>
+      </w:hyperlink>
+      <w:r>
+        <w:t>. last checked 2026-10</w:t>
+      </w:r>
+    </w:p>
+    <w:p>
+      <w:r>
+        <w:t xml:space="preserve">Cisco. </w:t>
+      </w:r>
+      <w:hyperlink r:id="rId12">
+        <w:r>
+          <w:rPr>
+            <w:color w:val="1E3A8A"/>
+            <w:u w:val="single"/>
+          </w:rPr>
+          <w:t>Cisco Collaboration Preferred Architectures</w:t>
+        </w:r>
+      </w:hyperlink>
+      <w:r>
+        <w:t>. last checked 2026-10</w:t>
+      </w:r>
+    </w:p>
+    <w:p>
+      <w:r>
+        <w:t xml:space="preserve">Community. </w:t>
+      </w:r>
+      <w:hyperlink r:id="rId13">
+        <w:r>
+          <w:rPr>
+            <w:color w:val="1E3A8A"/>
+            <w:u w:val="single"/>
+          </w:rPr>
+          <w:t>Cisco Community, Collaboration knowledge base</w:t>
+        </w:r>
+      </w:hyperlink>
+      <w:r>
+        <w:t>. last checked 2026-10</w:t>
+      </w:r>
+    </w:p>
+    <w:p>
+      <w:r>
+        <w:t xml:space="preserve">Wikipedia. </w:t>
+      </w:r>
+      <w:hyperlink r:id="rId14">
+        <w:r>
+          <w:rPr>
+            <w:color w:val="1E3A8A"/>
+            <w:u w:val="single"/>
+          </w:rPr>
+          <w:t>Voice over IP (Wikipedia)</w:t>
+        </w:r>
+      </w:hyperlink>
+      <w:r>
+        <w:t>. last checked 2026-10</w:t>
+      </w:r>
+    </w:p>
+    <w:p>
+      <w:r>
+        <w:t xml:space="preserve">Cisco. </w:t>
+      </w:r>
+      <w:hyperlink r:id="rId15">
+        <w:r>
+          <w:rPr>
+            <w:color w:val="1E3A8A"/>
+            <w:u w:val="single"/>
+          </w:rPr>
+          <w:t>System Configuration Guide for CUCM, Release 15</w:t>
+        </w:r>
+      </w:hyperlink>
+      <w:r>
+        <w:t>. last checked 2026-10</w:t>
+      </w:r>
+    </w:p>
+    <w:p>
+      <w:r>
+        <w:t xml:space="preserve">Webex. </w:t>
+      </w:r>
+      <w:hyperlink r:id="rId16">
+        <w:r>
+          <w:rPr>
+            <w:color w:val="1E3A8A"/>
+            <w:u w:val="single"/>
+          </w:rPr>
+          <w:t>Get started with Local Gateway</w:t>
+        </w:r>
+      </w:hyperlink>
+      <w:r>
+        <w:t>. last checked 2026-10</w:t>
+      </w:r>
+    </w:p>
+    <w:p>
+      <w:r>
+        <w:t xml:space="preserve">Webex. </w:t>
+      </w:r>
+      <w:hyperlink r:id="rId17">
+        <w:r>
+          <w:rPr>
+            <w:color w:val="1E3A8A"/>
+            <w:u w:val="single"/>
+          </w:rPr>
+          <w:t>Configure Local Gateway on Cisco IOS XE for Webex Calling</w:t>
+        </w:r>
+      </w:hyperlink>
+      <w:r>
+        <w:t>. last checked 2026-10</w:t>
+      </w:r>
+    </w:p>
+    <w:p>
+      <w:r>
+        <w:t xml:space="preserve">Protocol and ports. </w:t>
+      </w:r>
+      <w:hyperlink r:id="rId18">
+        <w:r>
+          <w:rPr>
+            <w:color w:val="1E3A8A"/>
+            <w:u w:val="single"/>
+          </w:rPr>
+          <w:t>Port reference for Webex Calling</w:t>
+        </w:r>
+      </w:hyperlink>
+      <w:r>
+        <w:t>. last checked 2026-10</w:t>
+      </w:r>
+    </w:p>
+    <w:p>
+      <w:r>
+        <w:t xml:space="preserve">Webex. </w:t>
+      </w:r>
+      <w:r>
+        <w:t>Webex Calling survivability gateway guide. confirm. A survivability-gateway article was not opened, so this row has no link. The local-gateway guide that did open is listed above. last checked 2026-10</w:t>
+      </w:r>
+    </w:p>
+    <w:p>
+      <w:r>
+        <w:t xml:space="preserve">Cisco. </w:t>
+      </w:r>
+      <w:hyperlink r:id="rId19">
+        <w:r>
+          <w:rPr>
+            <w:color w:val="1E3A8A"/>
+            <w:u w:val="single"/>
+          </w:rPr>
+          <w:t>Cisco Unified SRST product support</w:t>
+        </w:r>
+      </w:hyperlink>
+      <w:r>
+        <w:t>. last checked 2026-10</w:t>
       </w:r>
     </w:p>
     <w:sectPr>

</xml_diff>